<commit_message>
Chuyển dự án sang 100% dữ liệu All_Beauty, thêm kết quả BiLSTM
- Dùng toàn bộ danh mục (SAMPLE_FRAC=1.0): 691.806 review sạch
- BiLSTM train trên Colab GPU: Macro-F1 0,706 (tốt nhất), lưu kèm bản CPU và bản 15% để đối chiếu
- Cập nhật báo cáo BaoCao_DoAn.docx, đề tài cập nhật, agent.md, README, hướng dẫn chạy theo số liệu 100%
- Portal: chống bấm trùng "Chạy ngay" (khóa nút + backend trả 409)
- Thêm .gitignore, bỏ theo dõi __pycache__

Co-Authored-By: Claude Opus 5.5 <noreply@anthropic.com>
</commit_message>
<xml_diff>
--- a/detai_capnhat.docx
+++ b/detai_capnhat.docx
@@ -308,7 +308,7 @@
           <w:rFonts w:eastAsia="Times New Roman" w:cs="Times New Roman"/>
           <w:szCs w:val="26"/>
         </w:rPr>
-        <w:t xml:space="preserve"> Toàn bộ bộ dữ liệu có khoảng 571 triệu review, vượt quá khả năng xử lý của máy cá nhân. Dự án chọn danh mục All_Beauty và lấy mẫu ngẫu nhiên 15% (cố định hạt giống ngẫu nhiên để tái lập kết quả), thu được khoảng 105 nghìn review. Danh mục và tỷ lệ lấy mẫu có thể thay đổi qua cấu hình.</w:t>
+        <w:t xml:space="preserve"> Toàn bộ bộ dữ liệu có khoảng 571 triệu review, vượt quá khả năng xử lý của máy cá nhân, nên dự án chọn một danh mục là All_Beauty và sử dụng toàn bộ danh mục này: 701.528 review gốc, còn 691.806 review sau làm sạch. Hệ thống hỗ trợ lấy mẫu ngẫu nhiên qua cấu hình (cố định hạt giống để tái lập kết quả); giai đoạn phát triển dùng mẫu 15% để thử nghiệm nhanh.</w:t>
       </w:r>
     </w:p>
     <w:p>
@@ -377,7 +377,7 @@
           <w:rFonts w:eastAsia="Times New Roman" w:cs="Times New Roman"/>
           <w:szCs w:val="26"/>
         </w:rPr>
-        <w:t xml:space="preserve"> Docker Compose trên máy cá nhân (Python 3); mô hình học sâu huấn luyện bằng TensorFlow (CPU trên máy cá nhân, hoặc Google Colab nếu cần GPU).</w:t>
+        <w:t xml:space="preserve"> Docker Compose trên máy cá nhân (Python 3); mô hình học sâu huấn luyện bằng TensorFlow trên Google Colab (GPU).</w:t>
       </w:r>
     </w:p>
     <w:p>

</xml_diff>